<commit_message>
Update Como Estruturar um Projeto de Impacto.docx
</commit_message>
<xml_diff>
--- a/PEX/Estrutura Projeto de Extensão/Como Estruturar um Projeto de Impacto.docx
+++ b/PEX/Estrutura Projeto de Extensão/Como Estruturar um Projeto de Impacto.docx
@@ -122,7 +122,7 @@
           <w:sz w:val="21"/>
           <w:szCs w:val="21"/>
         </w:rPr>
-        <w:t>Qual  a empresa em questão;</w:t>
+        <w:t>Qual a empresa em questão;</w:t>
       </w:r>
     </w:p>
     <w:p>
@@ -178,27 +178,7 @@
           <w:sz w:val="21"/>
           <w:szCs w:val="21"/>
         </w:rPr>
-        <w:t>Quais causas d</w:t>
-      </w:r>
-      <w:r>
-        <w:rPr>
-          <w:rFonts w:ascii="Arial" w:hAnsi="Arial"/>
-          <w:b w:val="false"/>
-          <w:bCs w:val="false"/>
-          <w:sz w:val="21"/>
-          <w:szCs w:val="21"/>
-        </w:rPr>
-        <w:t>esse</w:t>
-      </w:r>
-      <w:r>
-        <w:rPr>
-          <w:rFonts w:ascii="Arial" w:hAnsi="Arial"/>
-          <w:b w:val="false"/>
-          <w:bCs w:val="false"/>
-          <w:sz w:val="21"/>
-          <w:szCs w:val="21"/>
-        </w:rPr>
-        <w:t>s problemas;</w:t>
+        <w:t>Quais causas desses problemas;</w:t>
       </w:r>
     </w:p>
     <w:p>
@@ -254,27 +234,7 @@
           <w:sz w:val="21"/>
           <w:szCs w:val="21"/>
         </w:rPr>
-        <w:t xml:space="preserve">Quais as </w:t>
-      </w:r>
-      <w:r>
-        <w:rPr>
-          <w:rFonts w:ascii="Arial" w:hAnsi="Arial"/>
-          <w:b w:val="false"/>
-          <w:bCs w:val="false"/>
-          <w:sz w:val="21"/>
-          <w:szCs w:val="21"/>
-        </w:rPr>
-        <w:t xml:space="preserve">consequências </w:t>
-      </w:r>
-      <w:r>
-        <w:rPr>
-          <w:rFonts w:ascii="Arial" w:hAnsi="Arial"/>
-          <w:b w:val="false"/>
-          <w:bCs w:val="false"/>
-          <w:sz w:val="21"/>
-          <w:szCs w:val="21"/>
-        </w:rPr>
-        <w:t>de ignorar esses problemas.</w:t>
+        <w:t>Quais as consequências de ignorar esses problemas.</w:t>
       </w:r>
     </w:p>
     <w:p>
@@ -924,6 +884,7 @@
       <w:pgNumType w:fmt="decimal"/>
       <w:formProt w:val="false"/>
       <w:textDirection w:val="lrTb"/>
+      <w:docGrid w:type="default" w:linePitch="100" w:charSpace="0"/>
     </w:sectPr>
   </w:body>
 </w:document>
@@ -1210,7 +1171,6 @@
     </w:rPrDefault>
     <w:pPrDefault>
       <w:pPr>
-        <w:widowControl/>
         <w:suppressAutoHyphens w:val="true"/>
       </w:pPr>
     </w:pPrDefault>
@@ -1220,7 +1180,10 @@
     <w:qFormat/>
     <w:pPr>
       <w:widowControl/>
+      <w:suppressAutoHyphens w:val="true"/>
       <w:bidi w:val="0"/>
+      <w:spacing w:before="0" w:after="0"/>
+      <w:jc w:val="start"/>
     </w:pPr>
     <w:rPr>
       <w:rFonts w:ascii="Liberation Serif" w:hAnsi="Liberation Serif" w:eastAsia="NSimSun" w:cs="Lucida Sans"/>
@@ -1231,8 +1194,8 @@
       <w:lang w:val="pt-BR" w:eastAsia="zh-CN" w:bidi="hi-IN"/>
     </w:rPr>
   </w:style>
-  <w:style w:type="character" w:styleId="Marcadores">
-    <w:name w:val="Marcadores"/>
+  <w:style w:type="character" w:styleId="Marcadoresuser">
+    <w:name w:val="Marcadores (user)"/>
     <w:qFormat/>
     <w:rPr>
       <w:rFonts w:ascii="OpenSymbol" w:hAnsi="OpenSymbol" w:eastAsia="OpenSymbol" w:cs="OpenSymbol"/>
@@ -1248,7 +1211,7 @@
       <w:spacing w:before="240" w:after="120"/>
     </w:pPr>
     <w:rPr>
-      <w:rFonts w:ascii="Liberation Sans" w:hAnsi="Liberation Sans" w:eastAsia="Microsoft YaHei" w:cs="Lucida Sans"/>
+      <w:rFonts w:ascii="Liberation Sans" w:hAnsi="Liberation Sans" w:eastAsia="Microsoft YaHei" w:cs="Arial"/>
       <w:sz w:val="28"/>
       <w:szCs w:val="28"/>
     </w:rPr>
@@ -1287,6 +1250,32 @@
   </w:style>
   <w:style w:type="paragraph" w:styleId="ndice">
     <w:name w:val="Índice"/>
+    <w:basedOn w:val="Normal"/>
+    <w:qFormat/>
+    <w:pPr>
+      <w:suppressLineNumbers/>
+    </w:pPr>
+    <w:rPr>
+      <w:rFonts w:cs="Arial"/>
+    </w:rPr>
+  </w:style>
+  <w:style w:type="paragraph" w:styleId="Ttulouser">
+    <w:name w:val="Título (user)"/>
+    <w:basedOn w:val="Normal"/>
+    <w:next w:val="BodyText"/>
+    <w:qFormat/>
+    <w:pPr>
+      <w:keepNext w:val="true"/>
+      <w:spacing w:before="240" w:after="120"/>
+    </w:pPr>
+    <w:rPr>
+      <w:rFonts w:ascii="Liberation Sans" w:hAnsi="Liberation Sans" w:eastAsia="Microsoft YaHei" w:cs="Lucida Sans"/>
+      <w:sz w:val="28"/>
+      <w:szCs w:val="28"/>
+    </w:rPr>
+  </w:style>
+  <w:style w:type="paragraph" w:styleId="ndiceuser">
+    <w:name w:val="Índice (user)"/>
     <w:basedOn w:val="Normal"/>
     <w:qFormat/>
     <w:pPr>

</xml_diff>